<commit_message>
Encadrés de capture séparés et règle de largeur des tableaux
Deux encadrés qui se suivent ne fusionnent plus dans Word, et SKILL.md
explique comment éviter qu'une colonne de tableau s'écrase.

Co-Authored-By: Claude Opus 5.5 <noreply@anthropic.com>
</commit_message>
<xml_diff>
--- a/modele/reference.docx
+++ b/modele/reference.docx
@@ -1232,6 +1232,18 @@
       <w:color w:val="7F7F7F"/>
       <w:sz w:val="20"/>
       <w:szCs w:val="20"/>
+    </w:rPr>
+  </w:style>
+  <w:style w:type="paragraph" w:customStyle="1" w:styleId="Separateur">
+    <w:name w:val="Separateur"/>
+    <w:basedOn w:val="Normal"/>
+    <w:qFormat/>
+    <w:pPr>
+      <w:spacing w:before="0" w:after="0" w:line="40" w:lineRule="exact"/>
+    </w:pPr>
+    <w:rPr>
+      <w:sz w:val="2"/>
+      <w:szCs w:val="2"/>
     </w:rPr>
   </w:style>
   <w:style w:type="character" w:customStyle="1" w:styleId="Rouge">

</xml_diff>